<commit_message>
Revisa texto da secao "Atividades em Grupos e Tira-Duvidas" da pre-ementa
Substitui os tres paragrafos finais da tabela por versao revisada:
- corrige gramatica/pontuacao (estudos de caso; Lei no 14.133/2021)
- organiza os eixos tematicos em (i)-(iv)
- melhora coesao e registro
Mantem os 5 objetivos, a capa e o restante do conteudo. Validado (XSD).

Co-Authored-By: Claude Opus 4.8 <noreply@anthropic.com>
Claude-Session: https://claude.ai/code/session_01HwPGT26GStSd8VTA6ntsSG
</commit_message>
<xml_diff>
--- a/001_Pré ementa de curso - Planejamento e Gestão de Obras Públicas_Compilado.docx
+++ b/001_Pré ementa de curso - Planejamento e Gestão de Obras Públicas_Compilado.docx
@@ -8487,7 +8487,7 @@
                 <w:sz w:val="22"/>
                 <w:szCs w:val="22"/>
               </w:rPr>
-              <w:t xml:space="preserve">A turma será dividida em 10 grupos com 10 membros cada grupo, para a discussão de 10 estudos de casos práticos dos temas abordados no curso: Planejamento da Contratação, Regimes de Execução Contratual, Contratação Integrada, Matriz de Riscos e Contratação Semi-Integrada e Orçamentação de Obras Públicas.</w:t>
+              <w:t xml:space="preserve">Na atividade de encerramento, a turma será organizada em 10 grupos, com cerca de 10 participantes cada, incumbidos de discutir 10 estudos de caso práticos que percorrem os eixos temáticos do curso: (i) Planejamento da Contratação; (ii) Regimes de Execução Contratual; (iii) Contratação Integrada, Matriz de Riscos e Contratação Semi-Integrada; e (iv) Orçamentação de Obras Públicas.</w:t>
             </w:r>
           </w:p>
           <w:p>
@@ -8515,15 +8515,15 @@
                 <w:sz w:val="22"/>
                 <w:szCs w:val="22"/>
               </w:rPr>
-              <w:t xml:space="preserve">Todas as discussões serão pautadas pela Lei nº14.133/2021, </w:t>
-            </w:r>
-            <w:r>
-              <w:rPr>
-                <w:rFonts w:cstheme="minorHAnsi"/>
-                <w:b w:val="0"/>
-                <w:bCs w:val="0"/>
-              </w:rPr>
-              <w:t xml:space="preserve">Decreto Municipal nº 62.100/2022 e demais legislações municipais correlatas aos temas abordados no curso, Jurisprudência do TCU, TCE/SP e TCM/SP.</w:t>
+              <w:t xml:space="preserve">As discussões serão conduzidas à luz da Lei nº 14.133/2021, do Decreto Municipal nº 62.100/2022 e das demais normas municipais correlatas, bem como da jurisprudência do TCU, do TCE/SP e do TCM/SP, de modo a articular fundamento legal, orientação dos órgãos de controle e aplicação prática.</w:t>
+            </w:r>
+            <w:r>
+              <w:rPr>
+                <w:rFonts w:cstheme="minorHAnsi"/>
+                <w:b w:val="0"/>
+                <w:bCs w:val="0"/>
+              </w:rPr>
+              <w:t xml:space="preserve"/>
             </w:r>
           </w:p>
           <w:p>
@@ -8551,7 +8551,7 @@
                 <w:b w:val="0"/>
                 <w:bCs w:val="0"/>
               </w:rPr>
-              <w:t>Por fim, a turma poderá tirar todas as dúvidas que ainda restem sobre o conteúdo do curso.</w:t>
+              <w:t xml:space="preserve">Ao final, será aberto espaço para o esclarecimento das dúvidas remanescentes, consolidando os conteúdos trabalhados ao longo do curso.</w:t>
             </w:r>
           </w:p>
         </w:tc>

</xml_diff>